<commit_message>
Document AT+FEED_ENABLE in the ADSBee 1090 datasheet
Add an AT+FEED_ENABLE section after AT+FEED (set and query syntax, parameter
table, default, and behaviour relative to per-feed active flags), modelled on
the AT+LED_ENABLE entry, plus a 20260924 revision history entry. The exported
PDF under word/exports is not regenerated.

Co-Authored-By: Claude Opus 5.5 (1M context) <noreply@anthropic.com>
</commit_message>
<xml_diff>
--- a/word/datasheet_adsbee_1090.docx
+++ b/word/datasheet_adsbee_1090.docx
@@ -9709,6 +9709,35 @@
       </w:r>
     </w:p>
     <w:p>
+      <w:r>
+        <w:t>20260924</w:t>
+      </w:r>
+    </w:p>
+    <w:p>
+      <w:pPr>
+        <w:pStyle w:val="ListParagraph"/>
+        <w:numPr>
+          <w:ilvl w:val="0"/>
+          <w:numId w:val="10"/>
+        </w:numPr>
+      </w:pPr>
+      <w:r>
+        <w:t>Added new AT command:</w:t>
+      </w:r>
+    </w:p>
+    <w:p>
+      <w:pPr>
+        <w:pStyle w:val="ListParagraph"/>
+        <w:numPr>
+          <w:ilvl w:val="1"/>
+          <w:numId w:val="10"/>
+        </w:numPr>
+      </w:pPr>
+      <w:r>
+        <w:t>AT+FEED_ENABLE</w:t>
+      </w:r>
+    </w:p>
+    <w:p>
       <w:pPr>
         <w:pStyle w:val="ListParagraph"/>
         <w:numPr>
@@ -13401,6 +13430,205 @@
       <w:proofErr w:type="gramEnd"/>
       <w:r>
         <w:t>00038172d18c(RECEIVER_ID)</w:t>
+      </w:r>
+    </w:p>
+    <w:p/>
+    <w:p>
+      <w:pPr>
+        <w:pStyle w:val="Heading2"/>
+        <w:numPr>
+          <w:ilvl w:val="1"/>
+          <w:numId w:val="4"/>
+        </w:numPr>
+      </w:pPr>
+      <w:bookmarkStart w:id="115" w:name="_Toc230658111"/>
+      <w:r>
+        <w:t>AT+FEED_ENABLE</w:t>
+      </w:r>
+      <w:bookmarkEnd w:id="115"/>
+    </w:p>
+    <w:p>
+      <w:pPr>
+        <w:pStyle w:val="Heading3"/>
+        <w:numPr>
+          <w:ilvl w:val="2"/>
+          <w:numId w:val="4"/>
+        </w:numPr>
+      </w:pPr>
+      <w:bookmarkStart w:id="116" w:name="_Toc230658112"/>
+      <w:r>
+        <w:t>Enable or Disable All Feeds</w:t>
+      </w:r>
+      <w:bookmarkEnd w:id="116"/>
+    </w:p>
+    <w:p>
+      <w:pPr>
+        <w:pStyle w:val="code"/>
+      </w:pPr>
+      <w:r>
+        <w:t>AT+FEED_ENABLE=&lt;enabled&gt;</w:t>
+      </w:r>
+    </w:p>
+    <w:p>
+      <w:pPr>
+        <w:pStyle w:val="code"/>
+      </w:pPr>
+      <w:r>
+        <w:t>OK</w:t>
+      </w:r>
+    </w:p>
+    <w:p/>
+    <w:p>
+      <w:r>
+        <w:t>Master switch for all outbound network feeds configured with AT+FEED. When disabled, no feed connections are opened and any open feed connections are closed, regardless of whether individual feeds are marked as active. The per-feed active flags set with AT+FEED are not modified, so re-enabling feeds with AT+FEED_ENABLE=1 resumes exactly the feeds that were previously active. The setting is synchronized to the ESP32 coprocessor. Feeds are enabled by default.</w:t>
+      </w:r>
+    </w:p>
+    <w:tbl>
+      <w:tblPr>
+        <w:tblStyle w:val="TableGrid"/>
+        <w:tblW w:w="0" w:type="auto"/>
+        <w:tblLook w:val="04A0" w:firstRow="1" w:lastRow="0" w:firstColumn="1" w:lastColumn="0" w:noHBand="0" w:noVBand="1"/>
+      </w:tblPr>
+      <w:tblGrid>
+        <w:gridCol w:w="1548"/>
+        <w:gridCol w:w="5796"/>
+        <w:gridCol w:w="3672"/>
+      </w:tblGrid>
+      <w:tr>
+        <w:tc>
+          <w:tcPr>
+            <w:tcW w:w="1548" w:type="dxa"/>
+          </w:tcPr>
+          <w:p>
+            <w:pPr>
+              <w:rPr>
+                <w:b/>
+                <w:bCs/>
+              </w:rPr>
+            </w:pPr>
+            <w:r>
+              <w:rPr>
+                <w:b/>
+                <w:bCs/>
+              </w:rPr>
+              <w:t>Parameter</w:t>
+            </w:r>
+          </w:p>
+        </w:tc>
+        <w:tc>
+          <w:tcPr>
+            <w:tcW w:w="5796" w:type="dxa"/>
+          </w:tcPr>
+          <w:p>
+            <w:pPr>
+              <w:rPr>
+                <w:b/>
+                <w:bCs/>
+              </w:rPr>
+            </w:pPr>
+            <w:r>
+              <w:rPr>
+                <w:b/>
+                <w:bCs/>
+              </w:rPr>
+              <w:t>Description</w:t>
+            </w:r>
+          </w:p>
+        </w:tc>
+        <w:tc>
+          <w:tcPr>
+            <w:tcW w:w="3672" w:type="dxa"/>
+          </w:tcPr>
+          <w:p>
+            <w:pPr>
+              <w:rPr>
+                <w:b/>
+                <w:bCs/>
+              </w:rPr>
+            </w:pPr>
+            <w:r>
+              <w:rPr>
+                <w:b/>
+                <w:bCs/>
+              </w:rPr>
+              <w:t>Acceptable Values</w:t>
+            </w:r>
+          </w:p>
+        </w:tc>
+      </w:tr>
+      <w:tr>
+        <w:tc>
+          <w:tcPr>
+            <w:tcW w:w="1548" w:type="dxa"/>
+          </w:tcPr>
+          <w:p>
+            <w:r>
+              <w:t>enabled</w:t>
+            </w:r>
+          </w:p>
+        </w:tc>
+        <w:tc>
+          <w:tcPr>
+            <w:tcW w:w="5796" w:type="dxa"/>
+          </w:tcPr>
+          <w:p>
+            <w:r>
+              <w:t>Whether outbound network feeds are enabled.</w:t>
+            </w:r>
+          </w:p>
+        </w:tc>
+        <w:tc>
+          <w:tcPr>
+            <w:tcW w:w="3672" w:type="dxa"/>
+          </w:tcPr>
+          <w:p>
+            <w:r>
+              <w:t>0 – All feeds are disabled.</w:t>
+            </w:r>
+          </w:p>
+          <w:p>
+            <w:r>
+              <w:t>1 – Feeds marked as active with AT+FEED are enabled (default).</w:t>
+            </w:r>
+          </w:p>
+        </w:tc>
+      </w:tr>
+    </w:tbl>
+    <w:p/>
+    <w:p>
+      <w:pPr>
+        <w:pStyle w:val="Heading3"/>
+        <w:numPr>
+          <w:ilvl w:val="2"/>
+          <w:numId w:val="4"/>
+        </w:numPr>
+      </w:pPr>
+      <w:bookmarkStart w:id="117" w:name="_Toc230658113"/>
+      <w:r>
+        <w:t>Query the Feed Enable Setting</w:t>
+      </w:r>
+      <w:bookmarkEnd w:id="117"/>
+    </w:p>
+    <w:p>
+      <w:pPr>
+        <w:pStyle w:val="code"/>
+      </w:pPr>
+      <w:r>
+        <w:t>AT+FEED_ENABLE?</w:t>
+      </w:r>
+    </w:p>
+    <w:p>
+      <w:pPr>
+        <w:pStyle w:val="code"/>
+      </w:pPr>
+      <w:r>
+        <w:t>FEED_ENABLE=&lt;enabled&gt;</w:t>
+      </w:r>
+    </w:p>
+    <w:p/>
+    <w:p>
+      <w:r>
+        <w:t>Queries whether outbound network feeds are enabled. This setting does not persist across a power cycle unless AT+SETTINGS=SAVE is run to write it to non-volatile storage.</w:t>
       </w:r>
     </w:p>
     <w:p/>

</xml_diff>

<commit_message>
Docs: Debug-only RF test commands, new USB strings in the HIL tooling
- firmware/README.md: which commands are Debug-only, how to tell a Debug
  build from AT+DEVICE_INFO?, how to build and flash one, and that AT+TX_CW
  is for conducted measurements only.
- m1421 and 1090 datasheets: the new Firmware Build line in the
  AT+DEVICE_INFO? example, and for the m1421 that AT+TX_CW needs a Debug
  build. The PDFs in word/exports are not regenerated.
- ci/hil: all RP2040 ADSBee 1090 variants now enumerate as 'Pants for
  Birds' / 'ADSBee 1090' and the programmer as 'Pants for Birds'. Update the
  usb.py comment, README example and test fixtures. 'ADSBee 1090' is not
  added as a model hint because it can't tell a 1090U from an m1090.
</commit_message>
<xml_diff>
--- a/word/datasheet_adsbee_1090.docx
+++ b/word/datasheet_adsbee_1090.docx
@@ -12058,6 +12058,19 @@
               <w:rPr>
                 <w:rFonts w:ascii="Courier New" w:hAnsi="Courier New" w:cs="Courier New"/>
               </w:rPr>
+              <w:t xml:space="preserve">RP2040 Firmware Build: Release</w:t>
+            </w:r>
+          </w:p>
+          <w:p>
+            <w:pPr>
+              <w:rPr>
+                <w:rFonts w:ascii="Courier New" w:hAnsi="Courier New" w:cs="Courier New"/>
+              </w:rPr>
+            </w:pPr>
+            <w:r>
+              <w:rPr>
+                <w:rFonts w:ascii="Courier New" w:hAnsi="Courier New" w:cs="Courier New"/>
+              </w:rPr>
               <w:t>OTA Key 0: cf737c4fce892fab44c6ec0d5d0f66dccf06c5630ac5b531f4067599df014d5ef213bb73205a9ce378318f259e3d01e3b99c089a75ac0735b204256b9371fbce</w:t>
             </w:r>
           </w:p>
@@ -12289,6 +12302,11 @@
               <w:t>D:0B:C7</w:t>
             </w:r>
             <w:proofErr w:type="gramEnd"/>
+          </w:p>
+          <w:p>
+            <w:r>
+              <w:t xml:space="preserve">The RP2040 Firmware Build line reads Debug or Release (firmware 0.9.1-rc7 and later). Published releases are Release builds; build.sh -d in firmware/adsbee_1090 makes a Debug build.</w:t>
+            </w:r>
           </w:p>
           <w:p/>
         </w:tc>

</xml_diff>